<commit_message>
Embed rendered Mermaid diagrams into the Word documentation
Render all 15 Mermaid diagrams to images locally (mermaid.js via headless
Chrome, auto-cropped with sharp) and embed them in-place in the .docx,
replacing the source blocks. The Word document now carries 25 figures — 10
product screenshots + 15 diagrams (architecture, ERD, sequences, workflow,
data-flow, state, deployment) — with all 19 tables preserved.

Co-Authored-By: Claude Opus 4.8 <noreply@anthropic.com>
</commit_message>
<xml_diff>
--- a/docs/Zarban-Complete-Documentation.docx
+++ b/docs/Zarban-Complete-Documentation.docx
@@ -5,7 +5,7 @@
     <w:sectPr>
       <w:pgSz w:w="12240" w:h="15840" w:orient="portrait"/>
       <w:pgMar w:top="1080" w:right="1080" w:bottom="1080" w:left="1080" w:header="undefined" w:footer="undefined" w:gutter="undefined"/>
-      <w:footerReference r:id="rId17" w:type="default"/>
+      <w:footerReference r:id="rId32" w:type="default"/>
     </w:sectPr>
     <w:p>
       <w:pPr>
@@ -127,12 +127,12 @@
           <wp:inline distB="0" distL="0" distR="0" distT="0">
             <wp:extent cx="6400800" cy="4000500"/>
             <wp:effectExtent b="0" l="0" r="0" t="0"/>
-            <wp:docPr id="1" name="image-QG2_9QeNsJL8L6INO_hJs.jpeg"/>
+            <wp:docPr id="1" name="image-dN94IdfBiC2kdw8Bdb_ty.jpeg"/>
             <a:graphic>
               <a:graphicData uri="http://schemas.openxmlformats.org/drawingml/2006/picture">
                 <pic:pic>
                   <pic:nvPicPr>
-                    <pic:cNvPr id="1" name="image-QG2_9QeNsJL8L6INO_hJs.jpeg" descr=""/>
+                    <pic:cNvPr id="1" name="image-dN94IdfBiC2kdw8Bdb_ty.jpeg" descr=""/>
                     <pic:cNvPicPr/>
                   </pic:nvPicPr>
                   <pic:blipFill>
@@ -2796,12 +2796,12 @@
           <wp:inline distB="0" distL="0" distR="0" distT="0">
             <wp:extent cx="6400800" cy="4224528"/>
             <wp:effectExtent b="0" l="0" r="0" t="0"/>
-            <wp:docPr id="2" name="image-hOyjPyTYpL0dfb8XR4tGD.jpeg"/>
+            <wp:docPr id="2" name="image-egIXeDHK6_D2E9ylMuEm8.jpeg"/>
             <a:graphic>
               <a:graphicData uri="http://schemas.openxmlformats.org/drawingml/2006/picture">
                 <pic:pic>
                   <pic:nvPicPr>
-                    <pic:cNvPr id="2" name="image-hOyjPyTYpL0dfb8XR4tGD.jpeg" descr=""/>
+                    <pic:cNvPr id="2" name="image-egIXeDHK6_D2E9ylMuEm8.jpeg" descr=""/>
                     <pic:cNvPicPr/>
                   </pic:nvPicPr>
                   <pic:blipFill>
@@ -4559,12 +4559,12 @@
           <wp:inline distB="0" distL="0" distR="0" distT="0">
             <wp:extent cx="6400800" cy="5869534"/>
             <wp:effectExtent b="0" l="0" r="0" t="0"/>
-            <wp:docPr id="3" name="image-VqOPeD5sRLoJjqRGXazgb.jpeg"/>
+            <wp:docPr id="3" name="image-vsNQlHfP2Lr0qswmCuQd0.jpeg"/>
             <a:graphic>
               <a:graphicData uri="http://schemas.openxmlformats.org/drawingml/2006/picture">
                 <pic:pic>
                   <pic:nvPicPr>
-                    <pic:cNvPr id="3" name="image-VqOPeD5sRLoJjqRGXazgb.jpeg" descr=""/>
+                    <pic:cNvPr id="3" name="image-vsNQlHfP2Lr0qswmCuQd0.jpeg" descr=""/>
                     <pic:cNvPicPr/>
                   </pic:nvPicPr>
                   <pic:blipFill>
@@ -11580,12 +11580,12 @@
           <wp:inline distB="0" distL="0" distR="0" distT="0">
             <wp:extent cx="6400800" cy="4224528"/>
             <wp:effectExtent b="0" l="0" r="0" t="0"/>
-            <wp:docPr id="4" name="image-meIbpeypIxUjZCo9xaBMJ.jpeg"/>
+            <wp:docPr id="4" name="image-VmTqZpVVvKU0zc1-ZzhWs.jpeg"/>
             <a:graphic>
               <a:graphicData uri="http://schemas.openxmlformats.org/drawingml/2006/picture">
                 <pic:pic>
                   <pic:nvPicPr>
-                    <pic:cNvPr id="4" name="image-meIbpeypIxUjZCo9xaBMJ.jpeg" descr=""/>
+                    <pic:cNvPr id="4" name="image-VmTqZpVVvKU0zc1-ZzhWs.jpeg" descr=""/>
                     <pic:cNvPicPr/>
                   </pic:nvPicPr>
                   <pic:blipFill>
@@ -12110,10 +12110,38 @@
         <w:spacing w:lineRule="auto"/>
       </w:pPr>
       <w:r>
-        <w:rPr>
-          <w:rFonts w:ascii="Courier" w:hAnsi="Courier"/>
-        </w:rPr>
-        <w:t xml:space="preserve">%% Diagram (Mermaid source — renders in the Markdown/GitHub copy) flowchart TD     subgraph Client       Stu[Student Browser]        Adm[Admin/Editor Browser]     end     subgraph Cloudflare_Worker[Cloudflare Worker · Next.js/vinext]       Pages[SSR Pages · RSC]       API[API Route Handlers]       Auth[Auth Guard · jose JWT + bcrypt]       Engine[Adaptive Engine · IRT/BKT/CDM/DKT]       Content[Content/Curriculum/Excel/PDF libs]       DBc[Prisma Client · lazy Proxy]       Cache[In-isolate TTL cache]     end     D1[(Cloudflare D1 · SQLite · 20 tables)]      Stu --&gt; Pages     Adm --&gt; Pages     Pages --&gt; API     Stu --&gt;|fetch| API     Adm --&gt;|fetch| API     API --&gt; Auth     API --&gt; Engine     API --&gt; Content     Engine --&gt; Cache     Engine --&gt; DBc     Content --&gt; DBc     Auth --&gt; DBc     DBc --&gt; D1     Cache -.seeds from.-&gt; DBc </w:t>
+        <w:rPr/>
+        <w:drawing>
+          <wp:inline distB="0" distL="0" distR="0" distT="0">
+            <wp:extent cx="6400800" cy="5218717"/>
+            <wp:effectExtent b="0" l="0" r="0" t="0"/>
+            <wp:docPr id="5" name="image-dTU-eRowZFRgcWGWe1wM4.png"/>
+            <a:graphic>
+              <a:graphicData uri="http://schemas.openxmlformats.org/drawingml/2006/picture">
+                <pic:pic>
+                  <pic:nvPicPr>
+                    <pic:cNvPr id="5" name="image-dTU-eRowZFRgcWGWe1wM4.png" descr=""/>
+                    <pic:cNvPicPr/>
+                  </pic:nvPicPr>
+                  <pic:blipFill>
+                    <a:blip r:embed="rId10" cstate="print"/>
+                    <a:srcRect b="0" l="0" r="0" t="0"/>
+                    <a:stretch>
+                      <a:fillRect/>
+                    </a:stretch>
+                  </pic:blipFill>
+                  <pic:spPr>
+                    <a:xfrm>
+                      <a:off x="0" y="0"/>
+                      <a:ext cx="6400800" cy="5218717"/>
+                    </a:xfrm>
+                    <a:prstGeom prst="rect"/>
+                  </pic:spPr>
+                </pic:pic>
+              </a:graphicData>
+            </a:graphic>
+          </wp:inline>
+        </w:drawing>
       </w:r>
     </w:p>
     <w:p>
@@ -14227,16 +14255,16 @@
           <wp:inline distB="0" distL="0" distR="0" distT="0">
             <wp:extent cx="6400800" cy="4442155"/>
             <wp:effectExtent b="0" l="0" r="0" t="0"/>
-            <wp:docPr id="5" name="image-aXUOJPB7UMargLzGC85GB.jpeg"/>
+            <wp:docPr id="6" name="image-yqO-dcczFI7XA7CSY2D5d.jpeg"/>
             <a:graphic>
               <a:graphicData uri="http://schemas.openxmlformats.org/drawingml/2006/picture">
                 <pic:pic>
                   <pic:nvPicPr>
-                    <pic:cNvPr id="5" name="image-aXUOJPB7UMargLzGC85GB.jpeg" descr=""/>
+                    <pic:cNvPr id="6" name="image-yqO-dcczFI7XA7CSY2D5d.jpeg" descr=""/>
                     <pic:cNvPicPr/>
                   </pic:nvPicPr>
                   <pic:blipFill>
-                    <a:blip r:embed="rId10" cstate="print"/>
+                    <a:blip r:embed="rId11" cstate="print"/>
                     <a:srcRect b="0" l="0" r="0" t="0"/>
                     <a:stretch>
                       <a:fillRect/>
@@ -16096,16 +16124,16 @@
           <wp:inline distB="0" distL="0" distR="0" distT="0">
             <wp:extent cx="6400800" cy="4224528"/>
             <wp:effectExtent b="0" l="0" r="0" t="0"/>
-            <wp:docPr id="6" name="image-P4KFvu_Zlab63Mh5NaPKu.jpeg"/>
+            <wp:docPr id="7" name="image-bl1uvGaWfU62lrbUxlzbm.jpeg"/>
             <a:graphic>
               <a:graphicData uri="http://schemas.openxmlformats.org/drawingml/2006/picture">
                 <pic:pic>
                   <pic:nvPicPr>
-                    <pic:cNvPr id="6" name="image-P4KFvu_Zlab63Mh5NaPKu.jpeg" descr=""/>
+                    <pic:cNvPr id="7" name="image-bl1uvGaWfU62lrbUxlzbm.jpeg" descr=""/>
                     <pic:cNvPicPr/>
                   </pic:nvPicPr>
                   <pic:blipFill>
-                    <a:blip r:embed="rId11" cstate="print"/>
+                    <a:blip r:embed="rId12" cstate="print"/>
                     <a:srcRect b="0" l="0" r="0" t="0"/>
                     <a:stretch>
                       <a:fillRect/>
@@ -16948,10 +16976,38 @@
         <w:spacing w:lineRule="auto"/>
       </w:pPr>
       <w:r>
-        <w:rPr>
-          <w:rFonts w:ascii="Courier" w:hAnsi="Courier"/>
-        </w:rPr>
-        <w:t xml:space="preserve">%% Diagram (Mermaid source — renders in the Markdown/GitHub copy) sequenceDiagram     actor S as Student     participant UI as Assessment Page     participant API as /api/session/respond     participant ENG as Orchestrator     participant DB as D1     S-&gt;&gt;UI: pick option A–D     UI-&gt;&gt;API: POST {session_id, question_id, option, time}     API-&gt;&gt;ENG: processResponse(...)     ENG-&gt;&gt;DB: read session + question (parallel)     ENG-&gt;&gt;DB: upsert BKT, propagate DKT     ENG-&gt;&gt;DB: read history, recompute θ     ENG-&gt;&gt;DB: create Response, update Session (parallel)     ENG-&gt;&gt;DB: fetch next question     ENG--&gt;&gt;API: StepResult (next Q or done)     API--&gt;&gt;UI: {step}     UI--&gt;&gt;S: render next question / go to report </w:t>
+        <w:rPr/>
+        <w:drawing>
+          <wp:inline distB="0" distL="0" distR="0" distT="0">
+            <wp:extent cx="6400800" cy="3190076"/>
+            <wp:effectExtent b="0" l="0" r="0" t="0"/>
+            <wp:docPr id="8" name="image-7ixSVI8DQqjuz0iXxnd-Y.png"/>
+            <a:graphic>
+              <a:graphicData uri="http://schemas.openxmlformats.org/drawingml/2006/picture">
+                <pic:pic>
+                  <pic:nvPicPr>
+                    <pic:cNvPr id="8" name="image-7ixSVI8DQqjuz0iXxnd-Y.png" descr=""/>
+                    <pic:cNvPicPr/>
+                  </pic:nvPicPr>
+                  <pic:blipFill>
+                    <a:blip r:embed="rId13" cstate="print"/>
+                    <a:srcRect b="0" l="0" r="0" t="0"/>
+                    <a:stretch>
+                      <a:fillRect/>
+                    </a:stretch>
+                  </pic:blipFill>
+                  <pic:spPr>
+                    <a:xfrm>
+                      <a:off x="0" y="0"/>
+                      <a:ext cx="6400800" cy="3190076"/>
+                    </a:xfrm>
+                    <a:prstGeom prst="rect"/>
+                  </pic:spPr>
+                </pic:pic>
+              </a:graphicData>
+            </a:graphic>
+          </wp:inline>
+        </w:drawing>
       </w:r>
     </w:p>
     <w:p>
@@ -16974,16 +17030,16 @@
           <wp:inline distB="0" distL="0" distR="0" distT="0">
             <wp:extent cx="6400800" cy="4224528"/>
             <wp:effectExtent b="0" l="0" r="0" t="0"/>
-            <wp:docPr id="7" name="image-nsqz49mW3G30MkxuOFevE.jpeg"/>
+            <wp:docPr id="9" name="image-aHlIuMOyzJRs-Nt2P8scW.jpeg"/>
             <a:graphic>
               <a:graphicData uri="http://schemas.openxmlformats.org/drawingml/2006/picture">
                 <pic:pic>
                   <pic:nvPicPr>
-                    <pic:cNvPr id="7" name="image-nsqz49mW3G30MkxuOFevE.jpeg" descr=""/>
+                    <pic:cNvPr id="9" name="image-aHlIuMOyzJRs-Nt2P8scW.jpeg" descr=""/>
                     <pic:cNvPicPr/>
                   </pic:nvPicPr>
                   <pic:blipFill>
-                    <a:blip r:embed="rId12" cstate="print"/>
+                    <a:blip r:embed="rId14" cstate="print"/>
                     <a:srcRect b="0" l="0" r="0" t="0"/>
                     <a:stretch>
                       <a:fillRect/>
@@ -18612,10 +18668,38 @@
         <w:spacing w:lineRule="auto"/>
       </w:pPr>
       <w:r>
-        <w:rPr>
-          <w:rFonts w:ascii="Courier" w:hAnsi="Courier"/>
-        </w:rPr>
-        <w:t xml:space="preserve">%% Diagram (Mermaid source — renders in the Markdown/GitHub copy) erDiagram     SKILL ||--o{ QUESTION : "primary skill"     SKILL ||--o{ KNOWLEDGE_GRAPH : "edges"     QUESTION ||--o{ ANSWER_TRAP : "traps"     QUESTION ||--o{ Q_MATRIX : "secondary skills"     QUESTION ||--o| QUESTION_DIMENSION : "dimensions"     STUDENT ||--o{ SESSION : takes     STUDENT ||--o{ BKT_STATE : masters     CLASSROOM ||--o{ STUDENT : rosters     ADMIN_USER ||--o{ CLASSROOM : teaches     SESSION ||--o{ RESPONSE : records     SESSION ||--o| DIMENSION_SCORE : scores     SESSION ||--o{ TRAVERSAL_EVENT : logs     QUESTION ||--o{ RESPONSE : answered     SUBJECT ||--o{ TOPIC : has     SUBJECT ||--o{ TEXTBOOK : has     SKILL { string skill_id PK }     QUESTION { string question_id PK  string primary_skill_id FK }     SESSION { string session_id PK  string student_id FK  string status }     RESPONSE { int response_id PK  string session_id FK  bool is_correct }     BKT_STATE { string student_id PK  string skill_id PK  float p_mastery }     STUDENT { string student_id PK  string email }     ADMIN_USER { int id PK  string email  string role } </w:t>
+        <w:rPr/>
+        <w:drawing>
+          <wp:inline distB="0" distL="0" distR="0" distT="0">
+            <wp:extent cx="6400800" cy="3608193"/>
+            <wp:effectExtent b="0" l="0" r="0" t="0"/>
+            <wp:docPr id="10" name="image-fIKoqppDxv1QNX_QNDYr8.png"/>
+            <a:graphic>
+              <a:graphicData uri="http://schemas.openxmlformats.org/drawingml/2006/picture">
+                <pic:pic>
+                  <pic:nvPicPr>
+                    <pic:cNvPr id="10" name="image-fIKoqppDxv1QNX_QNDYr8.png" descr=""/>
+                    <pic:cNvPicPr/>
+                  </pic:nvPicPr>
+                  <pic:blipFill>
+                    <a:blip r:embed="rId15" cstate="print"/>
+                    <a:srcRect b="0" l="0" r="0" t="0"/>
+                    <a:stretch>
+                      <a:fillRect/>
+                    </a:stretch>
+                  </pic:blipFill>
+                  <pic:spPr>
+                    <a:xfrm>
+                      <a:off x="0" y="0"/>
+                      <a:ext cx="6400800" cy="3608193"/>
+                    </a:xfrm>
+                    <a:prstGeom prst="rect"/>
+                  </pic:spPr>
+                </pic:pic>
+              </a:graphicData>
+            </a:graphic>
+          </wp:inline>
+        </w:drawing>
       </w:r>
     </w:p>
     <w:p>
@@ -18643,10 +18727,38 @@
         <w:spacing w:lineRule="auto"/>
       </w:pPr>
       <w:r>
-        <w:rPr>
-          <w:rFonts w:ascii="Courier" w:hAnsi="Courier"/>
-        </w:rPr>
-        <w:t xml:space="preserve">%% Diagram (Mermaid source — renders in the Markdown/GitHub copy) flowchart LR     Student((Student)) --&gt;|answers| Zarban[Zarban System]     Staff((Teacher/Admin/Editor)) --&gt;|manage/monitor| Zarban     Zarban --&gt;|report / analytics| Student     Zarban --&gt;|dashboards / exports| Staff     Zarban &lt;--&gt;|read/write| D1[(D1 Database)] </w:t>
+        <w:rPr/>
+        <w:drawing>
+          <wp:inline distB="0" distL="0" distR="0" distT="0">
+            <wp:extent cx="6400800" cy="2529348"/>
+            <wp:effectExtent b="0" l="0" r="0" t="0"/>
+            <wp:docPr id="11" name="image-FunoaRdyBpJdyncOveOjg.png"/>
+            <a:graphic>
+              <a:graphicData uri="http://schemas.openxmlformats.org/drawingml/2006/picture">
+                <pic:pic>
+                  <pic:nvPicPr>
+                    <pic:cNvPr id="11" name="image-FunoaRdyBpJdyncOveOjg.png" descr=""/>
+                    <pic:cNvPicPr/>
+                  </pic:nvPicPr>
+                  <pic:blipFill>
+                    <a:blip r:embed="rId16" cstate="print"/>
+                    <a:srcRect b="0" l="0" r="0" t="0"/>
+                    <a:stretch>
+                      <a:fillRect/>
+                    </a:stretch>
+                  </pic:blipFill>
+                  <pic:spPr>
+                    <a:xfrm>
+                      <a:off x="0" y="0"/>
+                      <a:ext cx="6400800" cy="2529348"/>
+                    </a:xfrm>
+                    <a:prstGeom prst="rect"/>
+                  </pic:spPr>
+                </pic:pic>
+              </a:graphicData>
+            </a:graphic>
+          </wp:inline>
+        </w:drawing>
       </w:r>
     </w:p>
     <w:p>
@@ -18664,10 +18776,38 @@
         <w:spacing w:lineRule="auto"/>
       </w:pPr>
       <w:r>
-        <w:rPr>
-          <w:rFonts w:ascii="Courier" w:hAnsi="Courier"/>
-        </w:rPr>
-        <w:t xml:space="preserve">%% Diagram (Mermaid source — renders in the Markdown/GitHub copy) flowchart TD     A[Enter name+grade] --&gt; B[Client validation]     B --&gt; C[/POST session/start/]     C --&gt; D[Create session · serve Q]     D --&gt; E[Render question]     E --&gt; F[Pick option]     F --&gt; G[/POST session/respond/]     G --&gt; H{Grade + engine}     H --&gt; I[Update IRT/BKT/DKT · persist]     I --&gt; J{Terminate?}     J -- no --&gt; K[Serve next Q] --&gt; E     J -- yes --&gt; L[Complete · dimension scores]     L --&gt; M[/GET report/] --&gt; N[Render diagnosis] </w:t>
+        <w:rPr/>
+        <w:drawing>
+          <wp:inline distB="0" distL="0" distR="0" distT="0">
+            <wp:extent cx="4305300" cy="14449425"/>
+            <wp:effectExtent b="0" l="0" r="0" t="0"/>
+            <wp:docPr id="12" name="image-VOFPWjoMHDMgi2G2gxOgj.png"/>
+            <a:graphic>
+              <a:graphicData uri="http://schemas.openxmlformats.org/drawingml/2006/picture">
+                <pic:pic>
+                  <pic:nvPicPr>
+                    <pic:cNvPr id="12" name="image-VOFPWjoMHDMgi2G2gxOgj.png" descr=""/>
+                    <pic:cNvPicPr/>
+                  </pic:nvPicPr>
+                  <pic:blipFill>
+                    <a:blip r:embed="rId17" cstate="print"/>
+                    <a:srcRect b="0" l="0" r="0" t="0"/>
+                    <a:stretch>
+                      <a:fillRect/>
+                    </a:stretch>
+                  </pic:blipFill>
+                  <pic:spPr>
+                    <a:xfrm>
+                      <a:off x="0" y="0"/>
+                      <a:ext cx="4305300" cy="14449425"/>
+                    </a:xfrm>
+                    <a:prstGeom prst="rect"/>
+                  </pic:spPr>
+                </pic:pic>
+              </a:graphicData>
+            </a:graphic>
+          </wp:inline>
+        </w:drawing>
       </w:r>
     </w:p>
     <w:p>
@@ -18708,10 +18848,38 @@
         <w:spacing w:lineRule="auto"/>
       </w:pPr>
       <w:r>
-        <w:rPr>
-          <w:rFonts w:ascii="Courier" w:hAnsi="Courier"/>
-        </w:rPr>
-        <w:t xml:space="preserve">%% Diagram (Mermaid source — renders in the Markdown/GitHub copy) flowchart TD     Start([Open site]) --&gt; Role{Student or Staff?}     Role -- Student --&gt; S1[Landing: name+grade] --&gt; S2[Adaptive test loop]     S2 --&gt; S3{End condition?}     S3 -- no --&gt; S2     S3 -- yes --&gt; S4[Diagnostic report] --&gt; S5[Practice gaps] --&gt; End1([Done])     Role -- Staff --&gt; L1[/admin/login/] --&gt; L2{Valid creds?}     L2 -- no --&gt; L1e[401: retry] --&gt; L1     L2 -- yes --&gt; L3[JWT cookie · role]     L3 --&gt; M{Role}     M -- Analytics --&gt; D1[Dashboard/analytics/students]     M -- Editor --&gt; C1[Content Studio]     M -- Admin --&gt; A1[All + DB manager + System]     D1 --&gt; Logout([Logout / 12h expiry])     C1 --&gt; Logout     A1 --&gt; Logout </w:t>
+        <w:rPr/>
+        <w:drawing>
+          <wp:inline distB="0" distL="0" distR="0" distT="0">
+            <wp:extent cx="6400800" cy="8094190"/>
+            <wp:effectExtent b="0" l="0" r="0" t="0"/>
+            <wp:docPr id="13" name="image-j9nd7bTCc92sZw3hW9lQR.png"/>
+            <a:graphic>
+              <a:graphicData uri="http://schemas.openxmlformats.org/drawingml/2006/picture">
+                <pic:pic>
+                  <pic:nvPicPr>
+                    <pic:cNvPr id="13" name="image-j9nd7bTCc92sZw3hW9lQR.png" descr=""/>
+                    <pic:cNvPicPr/>
+                  </pic:nvPicPr>
+                  <pic:blipFill>
+                    <a:blip r:embed="rId18" cstate="print"/>
+                    <a:srcRect b="0" l="0" r="0" t="0"/>
+                    <a:stretch>
+                      <a:fillRect/>
+                    </a:stretch>
+                  </pic:blipFill>
+                  <pic:spPr>
+                    <a:xfrm>
+                      <a:off x="0" y="0"/>
+                      <a:ext cx="6400800" cy="8094190"/>
+                    </a:xfrm>
+                    <a:prstGeom prst="rect"/>
+                  </pic:spPr>
+                </pic:pic>
+              </a:graphicData>
+            </a:graphic>
+          </wp:inline>
+        </w:drawing>
       </w:r>
     </w:p>
     <w:p>
@@ -18749,16 +18917,16 @@
           <wp:inline distB="0" distL="0" distR="0" distT="0">
             <wp:extent cx="6400800" cy="5869534"/>
             <wp:effectExtent b="0" l="0" r="0" t="0"/>
-            <wp:docPr id="8" name="image-3TMAEbogyFNop6TXgmU-Z.jpeg"/>
+            <wp:docPr id="14" name="image-6_TfZlNUaAw0Hgjnm2wcq.jpeg"/>
             <a:graphic>
               <a:graphicData uri="http://schemas.openxmlformats.org/drawingml/2006/picture">
                 <pic:pic>
                   <pic:nvPicPr>
-                    <pic:cNvPr id="8" name="image-3TMAEbogyFNop6TXgmU-Z.jpeg" descr=""/>
+                    <pic:cNvPr id="14" name="image-6_TfZlNUaAw0Hgjnm2wcq.jpeg" descr=""/>
                     <pic:cNvPicPr/>
                   </pic:nvPicPr>
                   <pic:blipFill>
-                    <a:blip r:embed="rId13" cstate="print"/>
+                    <a:blip r:embed="rId19" cstate="print"/>
                     <a:srcRect b="0" l="0" r="0" t="0"/>
                     <a:stretch>
                       <a:fillRect/>
@@ -19453,16 +19621,16 @@
           <wp:inline distB="0" distL="0" distR="0" distT="0">
             <wp:extent cx="6400800" cy="4224528"/>
             <wp:effectExtent b="0" l="0" r="0" t="0"/>
-            <wp:docPr id="9" name="image-HEDQ6lm6tPVmWnhlNxD7s.jpeg"/>
+            <wp:docPr id="15" name="image-ORYybNX6DatHJzwgChY7F.jpeg"/>
             <a:graphic>
               <a:graphicData uri="http://schemas.openxmlformats.org/drawingml/2006/picture">
                 <pic:pic>
                   <pic:nvPicPr>
-                    <pic:cNvPr id="9" name="image-HEDQ6lm6tPVmWnhlNxD7s.jpeg" descr=""/>
+                    <pic:cNvPr id="15" name="image-ORYybNX6DatHJzwgChY7F.jpeg" descr=""/>
                     <pic:cNvPicPr/>
                   </pic:nvPicPr>
                   <pic:blipFill>
-                    <a:blip r:embed="rId14" cstate="print"/>
+                    <a:blip r:embed="rId20" cstate="print"/>
                     <a:srcRect b="0" l="0" r="0" t="0"/>
                     <a:stretch>
                       <a:fillRect/>
@@ -20213,21 +20381,77 @@
         <w:spacing w:lineRule="auto"/>
       </w:pPr>
       <w:r>
-        <w:rPr>
-          <w:rFonts w:ascii="Courier" w:hAnsi="Courier"/>
-        </w:rPr>
-        <w:t xml:space="preserve">%% Diagram (Mermaid source — renders in the Markdown/GitHub copy) sequenceDiagram     actor U as Staff     participant UI as Login Page     participant API as /api/admin/auth/login     participant DB as admin_users     U-&gt;&gt;UI: email + password     UI-&gt;&gt;API: POST credentials     API-&gt;&gt;DB: find by email     DB--&gt;&gt;API: user + password_hash     API-&gt;&gt;API: bcrypt.compareSync     alt valid       API-&gt;&gt;API: jose sign JWT       API--&gt;&gt;UI: 200 + Set-Cookie zarban_admin       UI--&gt;&gt;U: redirect to /admin     else invalid       API--&gt;&gt;UI: 401 Invalid credentials       UI--&gt;&gt;U: show error     end </w:t>
-      </w:r>
-    </w:p>
-    <w:p>
-      <w:pPr>
-        <w:spacing w:lineRule="auto"/>
-      </w:pPr>
-      <w:r>
-        <w:rPr>
-          <w:rFonts w:ascii="Courier" w:hAnsi="Courier"/>
-        </w:rPr>
-        <w:t xml:space="preserve">%% Diagram (Mermaid source — renders in the Markdown/GitHub copy) sequenceDiagram     actor U as Staff     participant API as Protected Route     participant G as requireRole     U-&gt;&gt;API: request + cookie     API-&gt;&gt;G: verify JWT + role rank     alt no/invalid cookie       G--&gt;&gt;U: 401     else insufficient role       G--&gt;&gt;U: 403     else authorized       G--&gt;&gt;API: {session}       API--&gt;&gt;U: 200 data     end </w:t>
+        <w:rPr/>
+        <w:drawing>
+          <wp:inline distB="0" distL="0" distR="0" distT="0">
+            <wp:extent cx="6400800" cy="6405962"/>
+            <wp:effectExtent b="0" l="0" r="0" t="0"/>
+            <wp:docPr id="16" name="image-NeEcYCE6zidqktMw9mnzX.png"/>
+            <a:graphic>
+              <a:graphicData uri="http://schemas.openxmlformats.org/drawingml/2006/picture">
+                <pic:pic>
+                  <pic:nvPicPr>
+                    <pic:cNvPr id="16" name="image-NeEcYCE6zidqktMw9mnzX.png" descr=""/>
+                    <pic:cNvPicPr/>
+                  </pic:nvPicPr>
+                  <pic:blipFill>
+                    <a:blip r:embed="rId21" cstate="print"/>
+                    <a:srcRect b="0" l="0" r="0" t="0"/>
+                    <a:stretch>
+                      <a:fillRect/>
+                    </a:stretch>
+                  </pic:blipFill>
+                  <pic:spPr>
+                    <a:xfrm>
+                      <a:off x="0" y="0"/>
+                      <a:ext cx="6400800" cy="6405962"/>
+                    </a:xfrm>
+                    <a:prstGeom prst="rect"/>
+                  </pic:spPr>
+                </pic:pic>
+              </a:graphicData>
+            </a:graphic>
+          </wp:inline>
+        </w:drawing>
+      </w:r>
+    </w:p>
+    <w:p>
+      <w:pPr>
+        <w:spacing w:lineRule="auto"/>
+      </w:pPr>
+      <w:r>
+        <w:rPr/>
+        <w:drawing>
+          <wp:inline distB="0" distL="0" distR="0" distT="0">
+            <wp:extent cx="6400800" cy="7319665"/>
+            <wp:effectExtent b="0" l="0" r="0" t="0"/>
+            <wp:docPr id="17" name="image-LBNx7-bJ8Y9jK3hI0Bdta.png"/>
+            <a:graphic>
+              <a:graphicData uri="http://schemas.openxmlformats.org/drawingml/2006/picture">
+                <pic:pic>
+                  <pic:nvPicPr>
+                    <pic:cNvPr id="17" name="image-LBNx7-bJ8Y9jK3hI0Bdta.png" descr=""/>
+                    <pic:cNvPicPr/>
+                  </pic:nvPicPr>
+                  <pic:blipFill>
+                    <a:blip r:embed="rId22" cstate="print"/>
+                    <a:srcRect b="0" l="0" r="0" t="0"/>
+                    <a:stretch>
+                      <a:fillRect/>
+                    </a:stretch>
+                  </pic:blipFill>
+                  <pic:spPr>
+                    <a:xfrm>
+                      <a:off x="0" y="0"/>
+                      <a:ext cx="6400800" cy="7319665"/>
+                    </a:xfrm>
+                    <a:prstGeom prst="rect"/>
+                  </pic:spPr>
+                </pic:pic>
+              </a:graphicData>
+            </a:graphic>
+          </wp:inline>
+        </w:drawing>
       </w:r>
     </w:p>
     <w:p>
@@ -26257,10 +26481,38 @@
         <w:spacing w:lineRule="auto"/>
       </w:pPr>
       <w:r>
-        <w:rPr>
-          <w:rFonts w:ascii="Courier" w:hAnsi="Courier"/>
-        </w:rPr>
-        <w:t xml:space="preserve">%% Diagram (Mermaid source — renders in the Markdown/GitHub copy) flowchart LR     Dev[Developer] --&gt;|npm run build| Build[vinext/Vite bundle]     Build --&gt;|patch-d1| Cfg[dist/server/wrangler.json]     Cfg --&gt;|wrangler deploy| CF[Cloudflare Workers]     CF --&gt; D1[(D1 zarban)]     User((Users)) --&gt; CF </w:t>
+        <w:rPr/>
+        <w:drawing>
+          <wp:inline distB="0" distL="0" distR="0" distT="0">
+            <wp:extent cx="6400800" cy="763966"/>
+            <wp:effectExtent b="0" l="0" r="0" t="0"/>
+            <wp:docPr id="18" name="image-mbMpvBTU7seCJMB4eKb_S.png"/>
+            <a:graphic>
+              <a:graphicData uri="http://schemas.openxmlformats.org/drawingml/2006/picture">
+                <pic:pic>
+                  <pic:nvPicPr>
+                    <pic:cNvPr id="18" name="image-mbMpvBTU7seCJMB4eKb_S.png" descr=""/>
+                    <pic:cNvPicPr/>
+                  </pic:nvPicPr>
+                  <pic:blipFill>
+                    <a:blip r:embed="rId23" cstate="print"/>
+                    <a:srcRect b="0" l="0" r="0" t="0"/>
+                    <a:stretch>
+                      <a:fillRect/>
+                    </a:stretch>
+                  </pic:blipFill>
+                  <pic:spPr>
+                    <a:xfrm>
+                      <a:off x="0" y="0"/>
+                      <a:ext cx="6400800" cy="763966"/>
+                    </a:xfrm>
+                    <a:prstGeom prst="rect"/>
+                  </pic:spPr>
+                </pic:pic>
+              </a:graphicData>
+            </a:graphic>
+          </wp:inline>
+        </w:drawing>
       </w:r>
     </w:p>
     <w:p>
@@ -26447,7 +26699,7 @@
         </w:rPr>
         <w:t xml:space="preserve">URL:</w:t>
       </w:r>
-      <w:hyperlink r:id="rId15">
+      <w:hyperlink r:id="rId24">
         <w:r>
           <w:rPr>
             <w:rStyle w:val="Hyperlink"/>
@@ -27197,16 +27449,16 @@
           <wp:inline distB="0" distL="0" distR="0" distT="0">
             <wp:extent cx="6400800" cy="4224528"/>
             <wp:effectExtent b="0" l="0" r="0" t="0"/>
-            <wp:docPr id="10" name="image-zJCIepXPr7TPmTj9cJZ-M.jpeg"/>
+            <wp:docPr id="19" name="image-bs7tdlo1UfuvzP1vkF9hT.jpeg"/>
             <a:graphic>
               <a:graphicData uri="http://schemas.openxmlformats.org/drawingml/2006/picture">
                 <pic:pic>
                   <pic:nvPicPr>
-                    <pic:cNvPr id="10" name="image-zJCIepXPr7TPmTj9cJZ-M.jpeg" descr=""/>
+                    <pic:cNvPr id="19" name="image-bs7tdlo1UfuvzP1vkF9hT.jpeg" descr=""/>
                     <pic:cNvPicPr/>
                   </pic:nvPicPr>
                   <pic:blipFill>
-                    <a:blip r:embed="rId16" cstate="print"/>
+                    <a:blip r:embed="rId25" cstate="print"/>
                     <a:srcRect b="0" l="0" r="0" t="0"/>
                     <a:stretch>
                       <a:fillRect/>
@@ -31076,10 +31328,38 @@
         <w:spacing w:lineRule="auto"/>
       </w:pPr>
       <w:r>
-        <w:rPr>
-          <w:rFonts w:ascii="Courier" w:hAnsi="Courier"/>
-        </w:rPr>
-        <w:t xml:space="preserve">%% Diagram (Mermaid source — renders in the Markdown/GitHub copy) flowchart TD     App[Zarban App] --&gt; Student[Student]     App --&gt; Console[Admin Console]     App --&gt; Studio[Content Studio]     Student --&gt; Assess[Assessment] &amp; Report[Report/Analysis] &amp; Practice[Practice] &amp; Learn[Learn Hub]     Console --&gt; Dash[Dashboard/Analytics] &amp; People[Students/Classrooms] &amp; Ops[Settings/Users/System/DB]     Studio --&gt; Skills[Skills/Graph] &amp; Qs[Questions] &amp; Curr[Curriculum/Syllabus] &amp; IO[Import/Export] </w:t>
+        <w:rPr/>
+        <w:drawing>
+          <wp:inline distB="0" distL="0" distR="0" distT="0">
+            <wp:extent cx="6400800" cy="727833"/>
+            <wp:effectExtent b="0" l="0" r="0" t="0"/>
+            <wp:docPr id="20" name="image-RW3737rfdVToErp4bJ4hh.png"/>
+            <a:graphic>
+              <a:graphicData uri="http://schemas.openxmlformats.org/drawingml/2006/picture">
+                <pic:pic>
+                  <pic:nvPicPr>
+                    <pic:cNvPr id="20" name="image-RW3737rfdVToErp4bJ4hh.png" descr=""/>
+                    <pic:cNvPicPr/>
+                  </pic:nvPicPr>
+                  <pic:blipFill>
+                    <a:blip r:embed="rId26" cstate="print"/>
+                    <a:srcRect b="0" l="0" r="0" t="0"/>
+                    <a:stretch>
+                      <a:fillRect/>
+                    </a:stretch>
+                  </pic:blipFill>
+                  <pic:spPr>
+                    <a:xfrm>
+                      <a:off x="0" y="0"/>
+                      <a:ext cx="6400800" cy="727833"/>
+                    </a:xfrm>
+                    <a:prstGeom prst="rect"/>
+                  </pic:spPr>
+                </pic:pic>
+              </a:graphicData>
+            </a:graphic>
+          </wp:inline>
+        </w:drawing>
       </w:r>
     </w:p>
     <w:p>
@@ -31098,10 +31378,38 @@
         <w:spacing w:lineRule="auto"/>
       </w:pPr>
       <w:r>
-        <w:rPr>
-          <w:rFonts w:ascii="Courier" w:hAnsi="Courier"/>
-        </w:rPr>
-        <w:t xml:space="preserve">%% Diagram (Mermaid source — renders in the Markdown/GitHub copy) flowchart LR     Admin --&gt; Teacher --&gt; Viewer     Admin --&gt; Editor     Admin -.full.-&gt; All[All modules]     Teacher -.read.-&gt; Analytics     Viewer -.read-only.-&gt; Analytics     Editor -.write.-&gt; Content     Student((Student)) -.no auth.-&gt; Assess[Assess/Practice/Report] </w:t>
+        <w:rPr/>
+        <w:drawing>
+          <wp:inline distB="0" distL="0" distR="0" distT="0">
+            <wp:extent cx="6400800" cy="3164266"/>
+            <wp:effectExtent b="0" l="0" r="0" t="0"/>
+            <wp:docPr id="21" name="image-C5QPzRCRN7UvwtFo0Ck4S.png"/>
+            <a:graphic>
+              <a:graphicData uri="http://schemas.openxmlformats.org/drawingml/2006/picture">
+                <pic:pic>
+                  <pic:nvPicPr>
+                    <pic:cNvPr id="21" name="image-C5QPzRCRN7UvwtFo0Ck4S.png" descr=""/>
+                    <pic:cNvPicPr/>
+                  </pic:nvPicPr>
+                  <pic:blipFill>
+                    <a:blip r:embed="rId27" cstate="print"/>
+                    <a:srcRect b="0" l="0" r="0" t="0"/>
+                    <a:stretch>
+                      <a:fillRect/>
+                    </a:stretch>
+                  </pic:blipFill>
+                  <pic:spPr>
+                    <a:xfrm>
+                      <a:off x="0" y="0"/>
+                      <a:ext cx="6400800" cy="3164266"/>
+                    </a:xfrm>
+                    <a:prstGeom prst="rect"/>
+                  </pic:spPr>
+                </pic:pic>
+              </a:graphicData>
+            </a:graphic>
+          </wp:inline>
+        </w:drawing>
       </w:r>
     </w:p>
     <w:p>
@@ -31120,10 +31428,38 @@
         <w:spacing w:lineRule="auto"/>
       </w:pPr>
       <w:r>
-        <w:rPr>
-          <w:rFonts w:ascii="Courier" w:hAnsi="Courier"/>
-        </w:rPr>
-        <w:t xml:space="preserve">%% Diagram (Mermaid source — renders in the Markdown/GitHub copy) stateDiagram-v2     [*] --&gt; in_progress: start     in_progress --&gt; in_progress: answer (adapt)     in_progress --&gt; completed: max_questions / time_up / all_mastered / topics_exhausted     completed --&gt; [*] </w:t>
+        <w:rPr/>
+        <w:drawing>
+          <wp:inline distB="0" distL="0" distR="0" distT="0">
+            <wp:extent cx="5505450" cy="3581400"/>
+            <wp:effectExtent b="0" l="0" r="0" t="0"/>
+            <wp:docPr id="22" name="image-npELuPOYIOw9ejTuE0z6s.png"/>
+            <a:graphic>
+              <a:graphicData uri="http://schemas.openxmlformats.org/drawingml/2006/picture">
+                <pic:pic>
+                  <pic:nvPicPr>
+                    <pic:cNvPr id="22" name="image-npELuPOYIOw9ejTuE0z6s.png" descr=""/>
+                    <pic:cNvPicPr/>
+                  </pic:nvPicPr>
+                  <pic:blipFill>
+                    <a:blip r:embed="rId28" cstate="print"/>
+                    <a:srcRect b="0" l="0" r="0" t="0"/>
+                    <a:stretch>
+                      <a:fillRect/>
+                    </a:stretch>
+                  </pic:blipFill>
+                  <pic:spPr>
+                    <a:xfrm>
+                      <a:off x="0" y="0"/>
+                      <a:ext cx="5505450" cy="3581400"/>
+                    </a:xfrm>
+                    <a:prstGeom prst="rect"/>
+                  </pic:spPr>
+                </pic:pic>
+              </a:graphicData>
+            </a:graphic>
+          </wp:inline>
+        </w:drawing>
       </w:r>
     </w:p>
     <w:p>
@@ -31142,10 +31478,38 @@
         <w:spacing w:lineRule="auto"/>
       </w:pPr>
       <w:r>
-        <w:rPr>
-          <w:rFonts w:ascii="Courier" w:hAnsi="Courier"/>
-        </w:rPr>
-        <w:t xml:space="preserve">%% Diagram (Mermaid source — renders in the Markdown/GitHub copy) flowchart TD     Req[Request] --&gt; V{Valid input?}     V -- no --&gt; E400[400 + message]     V -- yes --&gt; A{Authenticated?}     A -- no --&gt; E401[401 → login]     A -- yes --&gt; R{Authorized?}     R -- no --&gt; E403[403]     R -- yes --&gt; P[Process]     P --&gt; Ok{Success?}     Ok -- yes --&gt; S200[200 + data]     Ok -- no --&gt; Log[console.error] --&gt; E500[4xx/5xx + error] </w:t>
+        <w:rPr/>
+        <w:drawing>
+          <wp:inline distB="0" distL="0" distR="0" distT="0">
+            <wp:extent cx="6400800" cy="13364308"/>
+            <wp:effectExtent b="0" l="0" r="0" t="0"/>
+            <wp:docPr id="23" name="image-RF-H7evNxY-hDyrQdSHMG.png"/>
+            <a:graphic>
+              <a:graphicData uri="http://schemas.openxmlformats.org/drawingml/2006/picture">
+                <pic:pic>
+                  <pic:nvPicPr>
+                    <pic:cNvPr id="23" name="image-RF-H7evNxY-hDyrQdSHMG.png" descr=""/>
+                    <pic:cNvPicPr/>
+                  </pic:nvPicPr>
+                  <pic:blipFill>
+                    <a:blip r:embed="rId29" cstate="print"/>
+                    <a:srcRect b="0" l="0" r="0" t="0"/>
+                    <a:stretch>
+                      <a:fillRect/>
+                    </a:stretch>
+                  </pic:blipFill>
+                  <pic:spPr>
+                    <a:xfrm>
+                      <a:off x="0" y="0"/>
+                      <a:ext cx="6400800" cy="13364308"/>
+                    </a:xfrm>
+                    <a:prstGeom prst="rect"/>
+                  </pic:spPr>
+                </pic:pic>
+              </a:graphicData>
+            </a:graphic>
+          </wp:inline>
+        </w:drawing>
       </w:r>
     </w:p>
     <w:p>
@@ -31164,10 +31528,38 @@
         <w:spacing w:lineRule="auto"/>
       </w:pPr>
       <w:r>
-        <w:rPr>
-          <w:rFonts w:ascii="Courier" w:hAnsi="Courier"/>
-        </w:rPr>
-        <w:t xml:space="preserve">%% Diagram (Mermaid source — renders in the Markdown/GitHub copy) flowchart LR     Sess[Completed session] --&gt; Gen[generateReport]     Gen --&gt; Web[Report page]     Gen --&gt; PDF[pdfkit → PDF download] </w:t>
+        <w:rPr/>
+        <w:drawing>
+          <wp:inline distB="0" distL="0" distR="0" distT="0">
+            <wp:extent cx="6400800" cy="1355665"/>
+            <wp:effectExtent b="0" l="0" r="0" t="0"/>
+            <wp:docPr id="24" name="image-auudmIn2hpCQSXeW9WMNf.png"/>
+            <a:graphic>
+              <a:graphicData uri="http://schemas.openxmlformats.org/drawingml/2006/picture">
+                <pic:pic>
+                  <pic:nvPicPr>
+                    <pic:cNvPr id="24" name="image-auudmIn2hpCQSXeW9WMNf.png" descr=""/>
+                    <pic:cNvPicPr/>
+                  </pic:nvPicPr>
+                  <pic:blipFill>
+                    <a:blip r:embed="rId30" cstate="print"/>
+                    <a:srcRect b="0" l="0" r="0" t="0"/>
+                    <a:stretch>
+                      <a:fillRect/>
+                    </a:stretch>
+                  </pic:blipFill>
+                  <pic:spPr>
+                    <a:xfrm>
+                      <a:off x="0" y="0"/>
+                      <a:ext cx="6400800" cy="1355665"/>
+                    </a:xfrm>
+                    <a:prstGeom prst="rect"/>
+                  </pic:spPr>
+                </pic:pic>
+              </a:graphicData>
+            </a:graphic>
+          </wp:inline>
+        </w:drawing>
       </w:r>
     </w:p>
     <w:p>
@@ -31186,10 +31578,38 @@
         <w:spacing w:lineRule="auto"/>
       </w:pPr>
       <w:r>
-        <w:rPr>
-          <w:rFonts w:ascii="Courier" w:hAnsi="Courier"/>
-        </w:rPr>
-        <w:t xml:space="preserve">%% Diagram (Mermaid source — renders in the Markdown/GitHub copy) flowchart LR     U[Upload .xlsx] --&gt; P[xlsx parser] --&gt; V[validate rows] --&gt; DB[(upsert content)] --&gt; R[result summary] </w:t>
+        <w:rPr/>
+        <w:drawing>
+          <wp:inline distB="0" distL="0" distR="0" distT="0">
+            <wp:extent cx="6400800" cy="609108"/>
+            <wp:effectExtent b="0" l="0" r="0" t="0"/>
+            <wp:docPr id="25" name="image-cKaCp-QjHmGkYqFyPAEtM.png"/>
+            <a:graphic>
+              <a:graphicData uri="http://schemas.openxmlformats.org/drawingml/2006/picture">
+                <pic:pic>
+                  <pic:nvPicPr>
+                    <pic:cNvPr id="25" name="image-cKaCp-QjHmGkYqFyPAEtM.png" descr=""/>
+                    <pic:cNvPicPr/>
+                  </pic:nvPicPr>
+                  <pic:blipFill>
+                    <a:blip r:embed="rId31" cstate="print"/>
+                    <a:srcRect b="0" l="0" r="0" t="0"/>
+                    <a:stretch>
+                      <a:fillRect/>
+                    </a:stretch>
+                  </pic:blipFill>
+                  <pic:spPr>
+                    <a:xfrm>
+                      <a:off x="0" y="0"/>
+                      <a:ext cx="6400800" cy="609108"/>
+                    </a:xfrm>
+                    <a:prstGeom prst="rect"/>
+                  </pic:spPr>
+                </pic:pic>
+              </a:graphicData>
+            </a:graphic>
+          </wp:inline>
+        </w:drawing>
       </w:r>
     </w:p>
     <w:p>

</xml_diff>